<commit_message>
knowleddge 7/3/2026 part 5
</commit_message>
<xml_diff>
--- a/Knowledge/3-Work knowledge/1-Software Engineering/2-General Technologies/9-Databases/5-My Source/2-SQL/1-Intro to SQL/5-SQL Injection.docx
+++ b/Knowledge/3-Work knowledge/1-Software Engineering/2-General Technologies/9-Databases/5-My Source/2-SQL/1-Intro to SQL/5-SQL Injection.docx
@@ -31,8 +31,14 @@
       </w:r>
     </w:p>
     <w:p>
-      <w:r>
-        <w:rPr>
+      <w:pPr>
+        <w:rPr>
+          <w:rFonts w:ascii="Arial" w:hAnsi="Arial" w:cs="Arial"/>
+        </w:rPr>
+      </w:pPr>
+      <w:r>
+        <w:rPr>
+          <w:rFonts w:ascii="Arial" w:hAnsi="Arial" w:cs="Arial"/>
           <w:b/>
           <w:color w:val="000000"/>
           <w:sz w:val="18"/>
@@ -42,14 +48,36 @@
       </w:r>
       <w:r>
         <w:rPr>
-          <w:color w:val="000000"/>
-          <w:sz w:val="18"/>
-          <w:highlight w:val="lightGray"/>
-        </w:rPr>
-        <w:t xml:space="preserve">: Persons Table -&gt; ID Column: 1, Name_En Column: Motasem Essam] -&gt; </w:t>
-      </w:r>
-      <w:r>
-        <w:rPr>
+          <w:rFonts w:ascii="Arial" w:hAnsi="Arial" w:cs="Arial"/>
+          <w:color w:val="000000"/>
+          <w:sz w:val="18"/>
+          <w:highlight w:val="lightGray"/>
+        </w:rPr>
+        <w:t xml:space="preserve">: Persons Table -&gt; ID Column: 1, </w:t>
+      </w:r>
+      <w:proofErr w:type="spellStart"/>
+      <w:r>
+        <w:rPr>
+          <w:rFonts w:ascii="Arial" w:hAnsi="Arial" w:cs="Arial"/>
+          <w:color w:val="000000"/>
+          <w:sz w:val="18"/>
+          <w:highlight w:val="lightGray"/>
+        </w:rPr>
+        <w:t>Name_En</w:t>
+      </w:r>
+      <w:proofErr w:type="spellEnd"/>
+      <w:r>
+        <w:rPr>
+          <w:rFonts w:ascii="Arial" w:hAnsi="Arial" w:cs="Arial"/>
+          <w:color w:val="000000"/>
+          <w:sz w:val="18"/>
+          <w:highlight w:val="lightGray"/>
+        </w:rPr>
+        <w:t xml:space="preserve"> Column: Motasem Essam] -&gt; </w:t>
+      </w:r>
+      <w:r>
+        <w:rPr>
+          <w:rFonts w:ascii="Arial" w:hAnsi="Arial" w:cs="Arial"/>
           <w:b/>
           <w:color w:val="000000"/>
           <w:sz w:val="18"/>
@@ -59,6 +87,7 @@
       </w:r>
       <w:r>
         <w:rPr>
+          <w:rFonts w:ascii="Arial" w:hAnsi="Arial" w:cs="Arial"/>
           <w:color w:val="000000"/>
           <w:sz w:val="18"/>
           <w:highlight w:val="lightGray"/>
@@ -67,6 +96,7 @@
       </w:r>
       <w:r>
         <w:rPr>
+          <w:rFonts w:ascii="Arial" w:hAnsi="Arial" w:cs="Arial"/>
           <w:b/>
           <w:color w:val="000000"/>
           <w:sz w:val="18"/>
@@ -76,6 +106,7 @@
       </w:r>
       <w:r>
         <w:rPr>
+          <w:rFonts w:ascii="Arial" w:hAnsi="Arial" w:cs="Arial"/>
           <w:color w:val="000000"/>
           <w:sz w:val="18"/>
           <w:highlight w:val="lightGray"/>
@@ -149,6 +180,7 @@
     <w:p>
       <w:r>
         <w:rPr>
+          <w:rFonts w:ascii="Arial" w:hAnsi="Arial" w:cs="Arial"/>
           <w:b/>
           <w:color w:val="000000"/>
           <w:sz w:val="18"/>
@@ -158,14 +190,36 @@
       </w:r>
       <w:r>
         <w:rPr>
-          <w:color w:val="000000"/>
-          <w:sz w:val="18"/>
-          <w:highlight w:val="lightGray"/>
-        </w:rPr>
-        <w:t xml:space="preserve">: Persons Table -&gt; ID Column: 1, Name_En Column: Motasem Essam] -&gt; </w:t>
-      </w:r>
-      <w:r>
-        <w:rPr>
+          <w:rFonts w:ascii="Arial" w:hAnsi="Arial" w:cs="Arial"/>
+          <w:color w:val="000000"/>
+          <w:sz w:val="18"/>
+          <w:highlight w:val="lightGray"/>
+        </w:rPr>
+        <w:t xml:space="preserve">: Persons Table -&gt; ID Column: 1, </w:t>
+      </w:r>
+      <w:proofErr w:type="spellStart"/>
+      <w:r>
+        <w:rPr>
+          <w:rFonts w:ascii="Arial" w:hAnsi="Arial" w:cs="Arial"/>
+          <w:color w:val="000000"/>
+          <w:sz w:val="18"/>
+          <w:highlight w:val="lightGray"/>
+        </w:rPr>
+        <w:t>Name_En</w:t>
+      </w:r>
+      <w:proofErr w:type="spellEnd"/>
+      <w:r>
+        <w:rPr>
+          <w:rFonts w:ascii="Arial" w:hAnsi="Arial" w:cs="Arial"/>
+          <w:color w:val="000000"/>
+          <w:sz w:val="18"/>
+          <w:highlight w:val="lightGray"/>
+        </w:rPr>
+        <w:t xml:space="preserve"> Column: Motasem Essam] -&gt; </w:t>
+      </w:r>
+      <w:r>
+        <w:rPr>
+          <w:rFonts w:ascii="Arial" w:hAnsi="Arial" w:cs="Arial"/>
           <w:b/>
           <w:color w:val="000000"/>
           <w:sz w:val="18"/>
@@ -175,6 +229,7 @@
       </w:r>
       <w:r>
         <w:rPr>
+          <w:rFonts w:ascii="Arial" w:hAnsi="Arial" w:cs="Arial"/>
           <w:color w:val="000000"/>
           <w:sz w:val="18"/>
           <w:highlight w:val="lightGray"/>
@@ -183,6 +238,7 @@
       </w:r>
       <w:r>
         <w:rPr>
+          <w:rFonts w:ascii="Arial" w:hAnsi="Arial" w:cs="Arial"/>
           <w:b/>
           <w:color w:val="000000"/>
           <w:sz w:val="18"/>
@@ -192,6 +248,7 @@
       </w:r>
       <w:r>
         <w:rPr>
+          <w:rFonts w:ascii="Arial" w:hAnsi="Arial" w:cs="Arial"/>
           <w:color w:val="000000"/>
           <w:sz w:val="18"/>
           <w:highlight w:val="lightGray"/>
@@ -352,6 +409,7 @@
     <w:p>
       <w:r>
         <w:rPr>
+          <w:rFonts w:ascii="Arial" w:hAnsi="Arial" w:cs="Arial"/>
           <w:b/>
           <w:color w:val="000000"/>
           <w:sz w:val="18"/>
@@ -361,14 +419,36 @@
       </w:r>
       <w:r>
         <w:rPr>
-          <w:color w:val="000000"/>
-          <w:sz w:val="18"/>
-          <w:highlight w:val="lightGray"/>
-        </w:rPr>
-        <w:t xml:space="preserve">: Persons Table -&gt; ID Column: 1, Name_En Column: Motasem Essam] -&gt; </w:t>
-      </w:r>
-      <w:r>
-        <w:rPr>
+          <w:rFonts w:ascii="Arial" w:hAnsi="Arial" w:cs="Arial"/>
+          <w:color w:val="000000"/>
+          <w:sz w:val="18"/>
+          <w:highlight w:val="lightGray"/>
+        </w:rPr>
+        <w:t xml:space="preserve">: Persons Table -&gt; ID Column: 1, </w:t>
+      </w:r>
+      <w:proofErr w:type="spellStart"/>
+      <w:r>
+        <w:rPr>
+          <w:rFonts w:ascii="Arial" w:hAnsi="Arial" w:cs="Arial"/>
+          <w:color w:val="000000"/>
+          <w:sz w:val="18"/>
+          <w:highlight w:val="lightGray"/>
+        </w:rPr>
+        <w:t>Name_En</w:t>
+      </w:r>
+      <w:proofErr w:type="spellEnd"/>
+      <w:r>
+        <w:rPr>
+          <w:rFonts w:ascii="Arial" w:hAnsi="Arial" w:cs="Arial"/>
+          <w:color w:val="000000"/>
+          <w:sz w:val="18"/>
+          <w:highlight w:val="lightGray"/>
+        </w:rPr>
+        <w:t xml:space="preserve"> Column: Motasem Essam] -&gt; </w:t>
+      </w:r>
+      <w:r>
+        <w:rPr>
+          <w:rFonts w:ascii="Arial" w:hAnsi="Arial" w:cs="Arial"/>
           <w:b/>
           <w:color w:val="000000"/>
           <w:sz w:val="18"/>
@@ -378,6 +458,7 @@
       </w:r>
       <w:r>
         <w:rPr>
+          <w:rFonts w:ascii="Arial" w:hAnsi="Arial" w:cs="Arial"/>
           <w:color w:val="000000"/>
           <w:sz w:val="18"/>
           <w:highlight w:val="lightGray"/>
@@ -386,6 +467,7 @@
       </w:r>
       <w:r>
         <w:rPr>
+          <w:rFonts w:ascii="Arial" w:hAnsi="Arial" w:cs="Arial"/>
           <w:b/>
           <w:color w:val="000000"/>
           <w:sz w:val="18"/>
@@ -395,6 +477,7 @@
       </w:r>
       <w:r>
         <w:rPr>
+          <w:rFonts w:ascii="Arial" w:hAnsi="Arial" w:cs="Arial"/>
           <w:color w:val="000000"/>
           <w:sz w:val="18"/>
           <w:highlight w:val="lightGray"/>
@@ -511,6 +594,7 @@
         <w:rPr>
           <w:rFonts w:ascii="Roboto Mono" w:hAnsi="Roboto Mono"/>
         </w:rPr>
+        <w:lastRenderedPageBreak/>
         <w:t>The application creates a query like:</w:t>
       </w:r>
     </w:p>
@@ -671,6 +755,7 @@
     <w:p>
       <w:r>
         <w:rPr>
+          <w:rFonts w:ascii="Arial" w:hAnsi="Arial" w:cs="Arial"/>
           <w:b/>
           <w:color w:val="000000"/>
           <w:sz w:val="18"/>
@@ -680,14 +765,36 @@
       </w:r>
       <w:r>
         <w:rPr>
-          <w:color w:val="000000"/>
-          <w:sz w:val="18"/>
-          <w:highlight w:val="lightGray"/>
-        </w:rPr>
-        <w:t xml:space="preserve">: Persons Table -&gt; ID Column: 1, Name_En Column: Motasem Essam] -&gt; </w:t>
-      </w:r>
-      <w:r>
-        <w:rPr>
+          <w:rFonts w:ascii="Arial" w:hAnsi="Arial" w:cs="Arial"/>
+          <w:color w:val="000000"/>
+          <w:sz w:val="18"/>
+          <w:highlight w:val="lightGray"/>
+        </w:rPr>
+        <w:t xml:space="preserve">: Persons Table -&gt; ID Column: 1, </w:t>
+      </w:r>
+      <w:proofErr w:type="spellStart"/>
+      <w:r>
+        <w:rPr>
+          <w:rFonts w:ascii="Arial" w:hAnsi="Arial" w:cs="Arial"/>
+          <w:color w:val="000000"/>
+          <w:sz w:val="18"/>
+          <w:highlight w:val="lightGray"/>
+        </w:rPr>
+        <w:t>Name_En</w:t>
+      </w:r>
+      <w:proofErr w:type="spellEnd"/>
+      <w:r>
+        <w:rPr>
+          <w:rFonts w:ascii="Arial" w:hAnsi="Arial" w:cs="Arial"/>
+          <w:color w:val="000000"/>
+          <w:sz w:val="18"/>
+          <w:highlight w:val="lightGray"/>
+        </w:rPr>
+        <w:t xml:space="preserve"> Column: Motasem Essam] -&gt; </w:t>
+      </w:r>
+      <w:r>
+        <w:rPr>
+          <w:rFonts w:ascii="Arial" w:hAnsi="Arial" w:cs="Arial"/>
           <w:b/>
           <w:color w:val="000000"/>
           <w:sz w:val="18"/>
@@ -697,6 +804,7 @@
       </w:r>
       <w:r>
         <w:rPr>
+          <w:rFonts w:ascii="Arial" w:hAnsi="Arial" w:cs="Arial"/>
           <w:color w:val="000000"/>
           <w:sz w:val="18"/>
           <w:highlight w:val="lightGray"/>
@@ -705,6 +813,7 @@
       </w:r>
       <w:r>
         <w:rPr>
+          <w:rFonts w:ascii="Arial" w:hAnsi="Arial" w:cs="Arial"/>
           <w:b/>
           <w:color w:val="000000"/>
           <w:sz w:val="18"/>
@@ -714,6 +823,7 @@
       </w:r>
       <w:r>
         <w:rPr>
+          <w:rFonts w:ascii="Arial" w:hAnsi="Arial" w:cs="Arial"/>
           <w:color w:val="000000"/>
           <w:sz w:val="18"/>
           <w:highlight w:val="lightGray"/>
@@ -804,7 +914,21 @@
         <w:rPr>
           <w:rFonts w:ascii="Roboto Mono" w:hAnsi="Roboto Mono"/>
         </w:rPr>
-        <w:t>$sql = "SELECT * FROM Users</w:t>
+        <w:t>$</w:t>
+      </w:r>
+      <w:proofErr w:type="spellStart"/>
+      <w:r>
+        <w:rPr>
+          <w:rFonts w:ascii="Roboto Mono" w:hAnsi="Roboto Mono"/>
+        </w:rPr>
+        <w:t>sql</w:t>
+      </w:r>
+      <w:proofErr w:type="spellEnd"/>
+      <w:r>
+        <w:rPr>
+          <w:rFonts w:ascii="Roboto Mono" w:hAnsi="Roboto Mono"/>
+        </w:rPr>
+        <w:t xml:space="preserve"> = "SELECT * FROM Users</w:t>
       </w:r>
     </w:p>
     <w:p>
@@ -882,6 +1006,7 @@
         <w:rPr>
           <w:rFonts w:ascii="Segoe UI Emoji" w:hAnsi="Segoe UI Emoji" w:cs="Segoe UI Emoji"/>
         </w:rPr>
+        <w:lastRenderedPageBreak/>
         <w:t>🚨</w:t>
       </w:r>
       <w:r>
@@ -891,6 +1016,7 @@
     <w:p>
       <w:r>
         <w:rPr>
+          <w:rFonts w:ascii="Arial" w:hAnsi="Arial" w:cs="Arial"/>
           <w:b/>
           <w:color w:val="000000"/>
           <w:sz w:val="18"/>
@@ -900,14 +1026,36 @@
       </w:r>
       <w:r>
         <w:rPr>
-          <w:color w:val="000000"/>
-          <w:sz w:val="18"/>
-          <w:highlight w:val="lightGray"/>
-        </w:rPr>
-        <w:t xml:space="preserve">: Persons Table -&gt; ID Column: 1, Name_En Column: Motasem Essam] -&gt; </w:t>
-      </w:r>
-      <w:r>
-        <w:rPr>
+          <w:rFonts w:ascii="Arial" w:hAnsi="Arial" w:cs="Arial"/>
+          <w:color w:val="000000"/>
+          <w:sz w:val="18"/>
+          <w:highlight w:val="lightGray"/>
+        </w:rPr>
+        <w:t xml:space="preserve">: Persons Table -&gt; ID Column: 1, </w:t>
+      </w:r>
+      <w:proofErr w:type="spellStart"/>
+      <w:r>
+        <w:rPr>
+          <w:rFonts w:ascii="Arial" w:hAnsi="Arial" w:cs="Arial"/>
+          <w:color w:val="000000"/>
+          <w:sz w:val="18"/>
+          <w:highlight w:val="lightGray"/>
+        </w:rPr>
+        <w:t>Name_En</w:t>
+      </w:r>
+      <w:proofErr w:type="spellEnd"/>
+      <w:r>
+        <w:rPr>
+          <w:rFonts w:ascii="Arial" w:hAnsi="Arial" w:cs="Arial"/>
+          <w:color w:val="000000"/>
+          <w:sz w:val="18"/>
+          <w:highlight w:val="lightGray"/>
+        </w:rPr>
+        <w:t xml:space="preserve"> Column: Motasem Essam] -&gt; </w:t>
+      </w:r>
+      <w:r>
+        <w:rPr>
+          <w:rFonts w:ascii="Arial" w:hAnsi="Arial" w:cs="Arial"/>
           <w:b/>
           <w:color w:val="000000"/>
           <w:sz w:val="18"/>
@@ -917,6 +1065,7 @@
       </w:r>
       <w:r>
         <w:rPr>
+          <w:rFonts w:ascii="Arial" w:hAnsi="Arial" w:cs="Arial"/>
           <w:color w:val="000000"/>
           <w:sz w:val="18"/>
           <w:highlight w:val="lightGray"/>
@@ -925,6 +1074,7 @@
       </w:r>
       <w:r>
         <w:rPr>
+          <w:rFonts w:ascii="Arial" w:hAnsi="Arial" w:cs="Arial"/>
           <w:b/>
           <w:color w:val="000000"/>
           <w:sz w:val="18"/>
@@ -934,6 +1084,7 @@
       </w:r>
       <w:r>
         <w:rPr>
+          <w:rFonts w:ascii="Arial" w:hAnsi="Arial" w:cs="Arial"/>
           <w:color w:val="000000"/>
           <w:sz w:val="18"/>
           <w:highlight w:val="lightGray"/>
@@ -1374,6 +1525,7 @@
         <w:rPr>
           <w:rFonts w:ascii="Roboto Mono" w:hAnsi="Roboto Mono"/>
         </w:rPr>
+        <w:lastRenderedPageBreak/>
         <w:t>'1'='1'</w:t>
       </w:r>
     </w:p>
@@ -1435,6 +1587,7 @@
     <w:p>
       <w:r>
         <w:rPr>
+          <w:rFonts w:ascii="Arial" w:hAnsi="Arial" w:cs="Arial"/>
           <w:b/>
           <w:color w:val="000000"/>
           <w:sz w:val="18"/>
@@ -1444,14 +1597,36 @@
       </w:r>
       <w:r>
         <w:rPr>
-          <w:color w:val="000000"/>
-          <w:sz w:val="18"/>
-          <w:highlight w:val="lightGray"/>
-        </w:rPr>
-        <w:t xml:space="preserve">: Persons Table -&gt; ID Column: 1, Name_En Column: Motasem Essam] -&gt; </w:t>
-      </w:r>
-      <w:r>
-        <w:rPr>
+          <w:rFonts w:ascii="Arial" w:hAnsi="Arial" w:cs="Arial"/>
+          <w:color w:val="000000"/>
+          <w:sz w:val="18"/>
+          <w:highlight w:val="lightGray"/>
+        </w:rPr>
+        <w:t xml:space="preserve">: Persons Table -&gt; ID Column: 1, </w:t>
+      </w:r>
+      <w:proofErr w:type="spellStart"/>
+      <w:r>
+        <w:rPr>
+          <w:rFonts w:ascii="Arial" w:hAnsi="Arial" w:cs="Arial"/>
+          <w:color w:val="000000"/>
+          <w:sz w:val="18"/>
+          <w:highlight w:val="lightGray"/>
+        </w:rPr>
+        <w:t>Name_En</w:t>
+      </w:r>
+      <w:proofErr w:type="spellEnd"/>
+      <w:r>
+        <w:rPr>
+          <w:rFonts w:ascii="Arial" w:hAnsi="Arial" w:cs="Arial"/>
+          <w:color w:val="000000"/>
+          <w:sz w:val="18"/>
+          <w:highlight w:val="lightGray"/>
+        </w:rPr>
+        <w:t xml:space="preserve"> Column: Motasem Essam] -&gt; </w:t>
+      </w:r>
+      <w:r>
+        <w:rPr>
+          <w:rFonts w:ascii="Arial" w:hAnsi="Arial" w:cs="Arial"/>
           <w:b/>
           <w:color w:val="000000"/>
           <w:sz w:val="18"/>
@@ -1461,6 +1636,7 @@
       </w:r>
       <w:r>
         <w:rPr>
+          <w:rFonts w:ascii="Arial" w:hAnsi="Arial" w:cs="Arial"/>
           <w:color w:val="000000"/>
           <w:sz w:val="18"/>
           <w:highlight w:val="lightGray"/>
@@ -1469,6 +1645,7 @@
       </w:r>
       <w:r>
         <w:rPr>
+          <w:rFonts w:ascii="Arial" w:hAnsi="Arial" w:cs="Arial"/>
           <w:b/>
           <w:color w:val="000000"/>
           <w:sz w:val="18"/>
@@ -1478,6 +1655,7 @@
       </w:r>
       <w:r>
         <w:rPr>
+          <w:rFonts w:ascii="Arial" w:hAnsi="Arial" w:cs="Arial"/>
           <w:color w:val="000000"/>
           <w:sz w:val="18"/>
           <w:highlight w:val="lightGray"/>
@@ -1833,6 +2011,7 @@
         <w:rPr>
           <w:rFonts w:ascii="Roboto Mono" w:hAnsi="Roboto Mono"/>
         </w:rPr>
+        <w:lastRenderedPageBreak/>
         <w:t>This can return all users.</w:t>
       </w:r>
     </w:p>
@@ -1874,6 +2053,7 @@
       </w:pPr>
       <w:r>
         <w:rPr>
+          <w:rFonts w:ascii="Arial" w:hAnsi="Arial" w:cs="Arial"/>
           <w:b/>
           <w:color w:val="000000"/>
           <w:sz w:val="18"/>
@@ -1883,14 +2063,36 @@
       </w:r>
       <w:r>
         <w:rPr>
-          <w:color w:val="000000"/>
-          <w:sz w:val="18"/>
-          <w:highlight w:val="lightGray"/>
-        </w:rPr>
-        <w:t xml:space="preserve">: Persons Table -&gt; ID Column: 1, Name_En Column: Motasem Essam] -&gt; </w:t>
-      </w:r>
-      <w:r>
-        <w:rPr>
+          <w:rFonts w:ascii="Arial" w:hAnsi="Arial" w:cs="Arial"/>
+          <w:color w:val="000000"/>
+          <w:sz w:val="18"/>
+          <w:highlight w:val="lightGray"/>
+        </w:rPr>
+        <w:t xml:space="preserve">: Persons Table -&gt; ID Column: 1, </w:t>
+      </w:r>
+      <w:proofErr w:type="spellStart"/>
+      <w:r>
+        <w:rPr>
+          <w:rFonts w:ascii="Arial" w:hAnsi="Arial" w:cs="Arial"/>
+          <w:color w:val="000000"/>
+          <w:sz w:val="18"/>
+          <w:highlight w:val="lightGray"/>
+        </w:rPr>
+        <w:t>Name_En</w:t>
+      </w:r>
+      <w:proofErr w:type="spellEnd"/>
+      <w:r>
+        <w:rPr>
+          <w:rFonts w:ascii="Arial" w:hAnsi="Arial" w:cs="Arial"/>
+          <w:color w:val="000000"/>
+          <w:sz w:val="18"/>
+          <w:highlight w:val="lightGray"/>
+        </w:rPr>
+        <w:t xml:space="preserve"> Column: Motasem Essam] -&gt; </w:t>
+      </w:r>
+      <w:r>
+        <w:rPr>
+          <w:rFonts w:ascii="Arial" w:hAnsi="Arial" w:cs="Arial"/>
           <w:b/>
           <w:color w:val="000000"/>
           <w:sz w:val="18"/>
@@ -1900,6 +2102,7 @@
       </w:r>
       <w:r>
         <w:rPr>
+          <w:rFonts w:ascii="Arial" w:hAnsi="Arial" w:cs="Arial"/>
           <w:color w:val="000000"/>
           <w:sz w:val="18"/>
           <w:highlight w:val="lightGray"/>
@@ -1908,6 +2111,7 @@
       </w:r>
       <w:r>
         <w:rPr>
+          <w:rFonts w:ascii="Arial" w:hAnsi="Arial" w:cs="Arial"/>
           <w:b/>
           <w:color w:val="000000"/>
           <w:sz w:val="18"/>
@@ -1917,6 +2121,7 @@
       </w:r>
       <w:r>
         <w:rPr>
+          <w:rFonts w:ascii="Arial" w:hAnsi="Arial" w:cs="Arial"/>
           <w:color w:val="000000"/>
           <w:sz w:val="18"/>
           <w:highlight w:val="lightGray"/>
@@ -2307,6 +2512,7 @@
     <w:p>
       <w:r>
         <w:rPr>
+          <w:rFonts w:ascii="Arial" w:hAnsi="Arial" w:cs="Arial"/>
           <w:b/>
           <w:color w:val="000000"/>
           <w:sz w:val="18"/>
@@ -2316,14 +2522,36 @@
       </w:r>
       <w:r>
         <w:rPr>
-          <w:color w:val="000000"/>
-          <w:sz w:val="18"/>
-          <w:highlight w:val="lightGray"/>
-        </w:rPr>
-        <w:t xml:space="preserve">: Persons Table -&gt; ID Column: 1, Name_En Column: Motasem Essam] -&gt; </w:t>
-      </w:r>
-      <w:r>
-        <w:rPr>
+          <w:rFonts w:ascii="Arial" w:hAnsi="Arial" w:cs="Arial"/>
+          <w:color w:val="000000"/>
+          <w:sz w:val="18"/>
+          <w:highlight w:val="lightGray"/>
+        </w:rPr>
+        <w:t xml:space="preserve">: Persons Table -&gt; ID Column: 1, </w:t>
+      </w:r>
+      <w:proofErr w:type="spellStart"/>
+      <w:r>
+        <w:rPr>
+          <w:rFonts w:ascii="Arial" w:hAnsi="Arial" w:cs="Arial"/>
+          <w:color w:val="000000"/>
+          <w:sz w:val="18"/>
+          <w:highlight w:val="lightGray"/>
+        </w:rPr>
+        <w:t>Name_En</w:t>
+      </w:r>
+      <w:proofErr w:type="spellEnd"/>
+      <w:r>
+        <w:rPr>
+          <w:rFonts w:ascii="Arial" w:hAnsi="Arial" w:cs="Arial"/>
+          <w:color w:val="000000"/>
+          <w:sz w:val="18"/>
+          <w:highlight w:val="lightGray"/>
+        </w:rPr>
+        <w:t xml:space="preserve"> Column: Motasem Essam] -&gt; </w:t>
+      </w:r>
+      <w:r>
+        <w:rPr>
+          <w:rFonts w:ascii="Arial" w:hAnsi="Arial" w:cs="Arial"/>
           <w:b/>
           <w:color w:val="000000"/>
           <w:sz w:val="18"/>
@@ -2333,6 +2561,7 @@
       </w:r>
       <w:r>
         <w:rPr>
+          <w:rFonts w:ascii="Arial" w:hAnsi="Arial" w:cs="Arial"/>
           <w:color w:val="000000"/>
           <w:sz w:val="18"/>
           <w:highlight w:val="lightGray"/>
@@ -2341,6 +2570,7 @@
       </w:r>
       <w:r>
         <w:rPr>
+          <w:rFonts w:ascii="Arial" w:hAnsi="Arial" w:cs="Arial"/>
           <w:b/>
           <w:color w:val="000000"/>
           <w:sz w:val="18"/>
@@ -2350,6 +2580,7 @@
       </w:r>
       <w:r>
         <w:rPr>
+          <w:rFonts w:ascii="Arial" w:hAnsi="Arial" w:cs="Arial"/>
           <w:color w:val="000000"/>
           <w:sz w:val="18"/>
           <w:highlight w:val="lightGray"/>
@@ -2459,6 +2690,7 @@
         <w:rPr>
           <w:rFonts w:ascii="Roboto Mono" w:hAnsi="Roboto Mono"/>
         </w:rPr>
+        <w:lastRenderedPageBreak/>
         <w:t>SELECT * FROM Customers;</w:t>
       </w:r>
     </w:p>
@@ -2579,7 +2811,21 @@
         <w:rPr>
           <w:rFonts w:ascii="Roboto Mono" w:hAnsi="Roboto Mono"/>
         </w:rPr>
-        <w:t>SET IsAdmin = 1;</w:t>
+        <w:t xml:space="preserve">SET </w:t>
+      </w:r>
+      <w:proofErr w:type="spellStart"/>
+      <w:r>
+        <w:rPr>
+          <w:rFonts w:ascii="Roboto Mono" w:hAnsi="Roboto Mono"/>
+        </w:rPr>
+        <w:t>IsAdmin</w:t>
+      </w:r>
+      <w:proofErr w:type="spellEnd"/>
+      <w:r>
+        <w:rPr>
+          <w:rFonts w:ascii="Roboto Mono" w:hAnsi="Roboto Mono"/>
+        </w:rPr>
+        <w:t xml:space="preserve"> = 1;</w:t>
       </w:r>
     </w:p>
     <w:p>
@@ -2828,6 +3074,7 @@
     <w:p>
       <w:r>
         <w:rPr>
+          <w:rFonts w:ascii="Arial" w:hAnsi="Arial" w:cs="Arial"/>
           <w:b/>
           <w:color w:val="000000"/>
           <w:sz w:val="18"/>
@@ -2837,14 +3084,36 @@
       </w:r>
       <w:r>
         <w:rPr>
-          <w:color w:val="000000"/>
-          <w:sz w:val="18"/>
-          <w:highlight w:val="lightGray"/>
-        </w:rPr>
-        <w:t xml:space="preserve">: Persons Table -&gt; ID Column: 1, Name_En Column: Motasem Essam] -&gt; </w:t>
-      </w:r>
-      <w:r>
-        <w:rPr>
+          <w:rFonts w:ascii="Arial" w:hAnsi="Arial" w:cs="Arial"/>
+          <w:color w:val="000000"/>
+          <w:sz w:val="18"/>
+          <w:highlight w:val="lightGray"/>
+        </w:rPr>
+        <w:t xml:space="preserve">: Persons Table -&gt; ID Column: 1, </w:t>
+      </w:r>
+      <w:proofErr w:type="spellStart"/>
+      <w:r>
+        <w:rPr>
+          <w:rFonts w:ascii="Arial" w:hAnsi="Arial" w:cs="Arial"/>
+          <w:color w:val="000000"/>
+          <w:sz w:val="18"/>
+          <w:highlight w:val="lightGray"/>
+        </w:rPr>
+        <w:t>Name_En</w:t>
+      </w:r>
+      <w:proofErr w:type="spellEnd"/>
+      <w:r>
+        <w:rPr>
+          <w:rFonts w:ascii="Arial" w:hAnsi="Arial" w:cs="Arial"/>
+          <w:color w:val="000000"/>
+          <w:sz w:val="18"/>
+          <w:highlight w:val="lightGray"/>
+        </w:rPr>
+        <w:t xml:space="preserve"> Column: Motasem Essam] -&gt; </w:t>
+      </w:r>
+      <w:r>
+        <w:rPr>
+          <w:rFonts w:ascii="Arial" w:hAnsi="Arial" w:cs="Arial"/>
           <w:b/>
           <w:color w:val="000000"/>
           <w:sz w:val="18"/>
@@ -2854,6 +3123,7 @@
       </w:r>
       <w:r>
         <w:rPr>
+          <w:rFonts w:ascii="Arial" w:hAnsi="Arial" w:cs="Arial"/>
           <w:color w:val="000000"/>
           <w:sz w:val="18"/>
           <w:highlight w:val="lightGray"/>
@@ -2862,6 +3132,7 @@
       </w:r>
       <w:r>
         <w:rPr>
+          <w:rFonts w:ascii="Arial" w:hAnsi="Arial" w:cs="Arial"/>
           <w:b/>
           <w:color w:val="000000"/>
           <w:sz w:val="18"/>
@@ -2871,6 +3142,7 @@
       </w:r>
       <w:r>
         <w:rPr>
+          <w:rFonts w:ascii="Arial" w:hAnsi="Arial" w:cs="Arial"/>
           <w:color w:val="000000"/>
           <w:sz w:val="18"/>
           <w:highlight w:val="lightGray"/>
@@ -2915,6 +3187,7 @@
         <w:rPr>
           <w:noProof/>
         </w:rPr>
+        <w:lastRenderedPageBreak/>
         <w:drawing>
           <wp:inline distT="0" distB="0" distL="0" distR="0" wp14:anchorId="62925665" wp14:editId="23094BD7">
             <wp:extent cx="5943600" cy="925830"/>
@@ -2975,7 +3248,21 @@
         <w:rPr>
           <w:rFonts w:ascii="Roboto Mono" w:hAnsi="Roboto Mono"/>
         </w:rPr>
-        <w:t>$sql = "SELECT *</w:t>
+        <w:t>$</w:t>
+      </w:r>
+      <w:proofErr w:type="spellStart"/>
+      <w:r>
+        <w:rPr>
+          <w:rFonts w:ascii="Roboto Mono" w:hAnsi="Roboto Mono"/>
+        </w:rPr>
+        <w:t>sql</w:t>
+      </w:r>
+      <w:proofErr w:type="spellEnd"/>
+      <w:r>
+        <w:rPr>
+          <w:rFonts w:ascii="Roboto Mono" w:hAnsi="Roboto Mono"/>
+        </w:rPr>
+        <w:t xml:space="preserve"> = "SELECT *</w:t>
       </w:r>
     </w:p>
     <w:p>
@@ -3140,7 +3427,21 @@
         <w:rPr>
           <w:rFonts w:ascii="Roboto Mono" w:hAnsi="Roboto Mono"/>
         </w:rPr>
-        <w:t>$stmt = $conn-&gt;prepare(</w:t>
+        <w:t>$</w:t>
+      </w:r>
+      <w:proofErr w:type="spellStart"/>
+      <w:r>
+        <w:rPr>
+          <w:rFonts w:ascii="Roboto Mono" w:hAnsi="Roboto Mono"/>
+        </w:rPr>
+        <w:t>stmt</w:t>
+      </w:r>
+      <w:proofErr w:type="spellEnd"/>
+      <w:r>
+        <w:rPr>
+          <w:rFonts w:ascii="Roboto Mono" w:hAnsi="Roboto Mono"/>
+        </w:rPr>
+        <w:t xml:space="preserve"> = $conn-&gt;prepare(</w:t>
       </w:r>
     </w:p>
     <w:p>
@@ -3227,6 +3528,7 @@
     <w:p>
       <w:r>
         <w:rPr>
+          <w:rFonts w:ascii="Arial" w:hAnsi="Arial" w:cs="Arial"/>
           <w:b/>
           <w:color w:val="000000"/>
           <w:sz w:val="18"/>
@@ -3236,14 +3538,36 @@
       </w:r>
       <w:r>
         <w:rPr>
-          <w:color w:val="000000"/>
-          <w:sz w:val="18"/>
-          <w:highlight w:val="lightGray"/>
-        </w:rPr>
-        <w:t xml:space="preserve">: Persons Table -&gt; ID Column: 1, Name_En Column: Motasem Essam] -&gt; </w:t>
-      </w:r>
-      <w:r>
-        <w:rPr>
+          <w:rFonts w:ascii="Arial" w:hAnsi="Arial" w:cs="Arial"/>
+          <w:color w:val="000000"/>
+          <w:sz w:val="18"/>
+          <w:highlight w:val="lightGray"/>
+        </w:rPr>
+        <w:t xml:space="preserve">: Persons Table -&gt; ID Column: 1, </w:t>
+      </w:r>
+      <w:proofErr w:type="spellStart"/>
+      <w:r>
+        <w:rPr>
+          <w:rFonts w:ascii="Arial" w:hAnsi="Arial" w:cs="Arial"/>
+          <w:color w:val="000000"/>
+          <w:sz w:val="18"/>
+          <w:highlight w:val="lightGray"/>
+        </w:rPr>
+        <w:t>Name_En</w:t>
+      </w:r>
+      <w:proofErr w:type="spellEnd"/>
+      <w:r>
+        <w:rPr>
+          <w:rFonts w:ascii="Arial" w:hAnsi="Arial" w:cs="Arial"/>
+          <w:color w:val="000000"/>
+          <w:sz w:val="18"/>
+          <w:highlight w:val="lightGray"/>
+        </w:rPr>
+        <w:t xml:space="preserve"> Column: Motasem Essam] -&gt; </w:t>
+      </w:r>
+      <w:r>
+        <w:rPr>
+          <w:rFonts w:ascii="Arial" w:hAnsi="Arial" w:cs="Arial"/>
           <w:b/>
           <w:color w:val="000000"/>
           <w:sz w:val="18"/>
@@ -3253,6 +3577,7 @@
       </w:r>
       <w:r>
         <w:rPr>
+          <w:rFonts w:ascii="Arial" w:hAnsi="Arial" w:cs="Arial"/>
           <w:color w:val="000000"/>
           <w:sz w:val="18"/>
           <w:highlight w:val="lightGray"/>
@@ -3261,6 +3586,7 @@
       </w:r>
       <w:r>
         <w:rPr>
+          <w:rFonts w:ascii="Arial" w:hAnsi="Arial" w:cs="Arial"/>
           <w:b/>
           <w:color w:val="000000"/>
           <w:sz w:val="18"/>
@@ -3270,6 +3596,7 @@
       </w:r>
       <w:r>
         <w:rPr>
+          <w:rFonts w:ascii="Arial" w:hAnsi="Arial" w:cs="Arial"/>
           <w:color w:val="000000"/>
           <w:sz w:val="18"/>
           <w:highlight w:val="lightGray"/>
@@ -3317,6 +3644,7 @@
         <w:rPr>
           <w:rFonts w:ascii="Roboto Mono" w:hAnsi="Roboto Mono"/>
         </w:rPr>
+        <w:lastRenderedPageBreak/>
         <w:t>Example:</w:t>
       </w:r>
     </w:p>
@@ -3390,7 +3718,35 @@
         <w:rPr>
           <w:rFonts w:ascii="Roboto Mono" w:hAnsi="Roboto Mono"/>
         </w:rPr>
-        <w:t>$stmt = $pdo-&gt;prepare(</w:t>
+        <w:t>$</w:t>
+      </w:r>
+      <w:proofErr w:type="spellStart"/>
+      <w:r>
+        <w:rPr>
+          <w:rFonts w:ascii="Roboto Mono" w:hAnsi="Roboto Mono"/>
+        </w:rPr>
+        <w:t>stmt</w:t>
+      </w:r>
+      <w:proofErr w:type="spellEnd"/>
+      <w:r>
+        <w:rPr>
+          <w:rFonts w:ascii="Roboto Mono" w:hAnsi="Roboto Mono"/>
+        </w:rPr>
+        <w:t xml:space="preserve"> = $</w:t>
+      </w:r>
+      <w:proofErr w:type="spellStart"/>
+      <w:r>
+        <w:rPr>
+          <w:rFonts w:ascii="Roboto Mono" w:hAnsi="Roboto Mono"/>
+        </w:rPr>
+        <w:t>pdo</w:t>
+      </w:r>
+      <w:proofErr w:type="spellEnd"/>
+      <w:r>
+        <w:rPr>
+          <w:rFonts w:ascii="Roboto Mono" w:hAnsi="Roboto Mono"/>
+        </w:rPr>
+        <w:t>-&gt;prepare(</w:t>
       </w:r>
     </w:p>
     <w:p>
@@ -3818,8 +4174,17 @@
         <w:rPr>
           <w:rFonts w:ascii="Roboto Mono" w:hAnsi="Roboto Mono"/>
         </w:rPr>
-        <w:t>Only numbers allowed for UserID</w:t>
-      </w:r>
+        <w:lastRenderedPageBreak/>
+        <w:t xml:space="preserve">Only numbers allowed for </w:t>
+      </w:r>
+      <w:proofErr w:type="spellStart"/>
+      <w:r>
+        <w:rPr>
+          <w:rFonts w:ascii="Roboto Mono" w:hAnsi="Roboto Mono"/>
+        </w:rPr>
+        <w:t>UserID</w:t>
+      </w:r>
+      <w:proofErr w:type="spellEnd"/>
     </w:p>
     <w:p>
       <w:pPr>
@@ -4220,6 +4585,7 @@
       </w:pPr>
       <w:r>
         <w:rPr>
+          <w:rFonts w:ascii="Arial" w:hAnsi="Arial" w:cs="Arial"/>
           <w:b/>
           <w:color w:val="000000"/>
           <w:sz w:val="18"/>
@@ -4229,14 +4595,36 @@
       </w:r>
       <w:r>
         <w:rPr>
-          <w:color w:val="000000"/>
-          <w:sz w:val="18"/>
-          <w:highlight w:val="lightGray"/>
-        </w:rPr>
-        <w:t xml:space="preserve">: Persons Table -&gt; ID Column: 1, Name_En Column: Motasem Essam] -&gt; </w:t>
-      </w:r>
-      <w:r>
-        <w:rPr>
+          <w:rFonts w:ascii="Arial" w:hAnsi="Arial" w:cs="Arial"/>
+          <w:color w:val="000000"/>
+          <w:sz w:val="18"/>
+          <w:highlight w:val="lightGray"/>
+        </w:rPr>
+        <w:t xml:space="preserve">: Persons Table -&gt; ID Column: 1, </w:t>
+      </w:r>
+      <w:proofErr w:type="spellStart"/>
+      <w:r>
+        <w:rPr>
+          <w:rFonts w:ascii="Arial" w:hAnsi="Arial" w:cs="Arial"/>
+          <w:color w:val="000000"/>
+          <w:sz w:val="18"/>
+          <w:highlight w:val="lightGray"/>
+        </w:rPr>
+        <w:t>Name_En</w:t>
+      </w:r>
+      <w:proofErr w:type="spellEnd"/>
+      <w:r>
+        <w:rPr>
+          <w:rFonts w:ascii="Arial" w:hAnsi="Arial" w:cs="Arial"/>
+          <w:color w:val="000000"/>
+          <w:sz w:val="18"/>
+          <w:highlight w:val="lightGray"/>
+        </w:rPr>
+        <w:t xml:space="preserve"> Column: Motasem Essam] -&gt; </w:t>
+      </w:r>
+      <w:r>
+        <w:rPr>
+          <w:rFonts w:ascii="Arial" w:hAnsi="Arial" w:cs="Arial"/>
           <w:b/>
           <w:color w:val="000000"/>
           <w:sz w:val="18"/>
@@ -4246,6 +4634,7 @@
       </w:r>
       <w:r>
         <w:rPr>
+          <w:rFonts w:ascii="Arial" w:hAnsi="Arial" w:cs="Arial"/>
           <w:color w:val="000000"/>
           <w:sz w:val="18"/>
           <w:highlight w:val="lightGray"/>
@@ -4254,6 +4643,7 @@
       </w:r>
       <w:r>
         <w:rPr>
+          <w:rFonts w:ascii="Arial" w:hAnsi="Arial" w:cs="Arial"/>
           <w:b/>
           <w:color w:val="000000"/>
           <w:sz w:val="18"/>
@@ -4263,6 +4653,7 @@
       </w:r>
       <w:r>
         <w:rPr>
+          <w:rFonts w:ascii="Arial" w:hAnsi="Arial" w:cs="Arial"/>
           <w:color w:val="000000"/>
           <w:sz w:val="18"/>
           <w:highlight w:val="lightGray"/>
@@ -4275,6 +4666,7 @@
         <w:rPr>
           <w:noProof/>
         </w:rPr>
+        <w:lastRenderedPageBreak/>
         <w:drawing>
           <wp:inline distT="0" distB="0" distL="0" distR="0" wp14:anchorId="0CBA7127" wp14:editId="67939665">
             <wp:extent cx="5943600" cy="1567815"/>
@@ -4572,6 +4964,7 @@
     <w:p>
       <w:r>
         <w:rPr>
+          <w:rFonts w:ascii="Arial" w:hAnsi="Arial" w:cs="Arial"/>
           <w:b/>
           <w:color w:val="000000"/>
           <w:sz w:val="18"/>
@@ -4581,14 +4974,36 @@
       </w:r>
       <w:r>
         <w:rPr>
-          <w:color w:val="000000"/>
-          <w:sz w:val="18"/>
-          <w:highlight w:val="lightGray"/>
-        </w:rPr>
-        <w:t xml:space="preserve">: Persons Table -&gt; ID Column: 1, Name_En Column: Motasem Essam] -&gt; </w:t>
-      </w:r>
-      <w:r>
-        <w:rPr>
+          <w:rFonts w:ascii="Arial" w:hAnsi="Arial" w:cs="Arial"/>
+          <w:color w:val="000000"/>
+          <w:sz w:val="18"/>
+          <w:highlight w:val="lightGray"/>
+        </w:rPr>
+        <w:t xml:space="preserve">: Persons Table -&gt; ID Column: 1, </w:t>
+      </w:r>
+      <w:proofErr w:type="spellStart"/>
+      <w:r>
+        <w:rPr>
+          <w:rFonts w:ascii="Arial" w:hAnsi="Arial" w:cs="Arial"/>
+          <w:color w:val="000000"/>
+          <w:sz w:val="18"/>
+          <w:highlight w:val="lightGray"/>
+        </w:rPr>
+        <w:t>Name_En</w:t>
+      </w:r>
+      <w:proofErr w:type="spellEnd"/>
+      <w:r>
+        <w:rPr>
+          <w:rFonts w:ascii="Arial" w:hAnsi="Arial" w:cs="Arial"/>
+          <w:color w:val="000000"/>
+          <w:sz w:val="18"/>
+          <w:highlight w:val="lightGray"/>
+        </w:rPr>
+        <w:t xml:space="preserve"> Column: Motasem Essam] -&gt; </w:t>
+      </w:r>
+      <w:r>
+        <w:rPr>
+          <w:rFonts w:ascii="Arial" w:hAnsi="Arial" w:cs="Arial"/>
           <w:b/>
           <w:color w:val="000000"/>
           <w:sz w:val="18"/>
@@ -4598,6 +5013,7 @@
       </w:r>
       <w:r>
         <w:rPr>
+          <w:rFonts w:ascii="Arial" w:hAnsi="Arial" w:cs="Arial"/>
           <w:color w:val="000000"/>
           <w:sz w:val="18"/>
           <w:highlight w:val="lightGray"/>
@@ -4606,6 +5022,7 @@
       </w:r>
       <w:r>
         <w:rPr>
+          <w:rFonts w:ascii="Arial" w:hAnsi="Arial" w:cs="Arial"/>
           <w:b/>
           <w:color w:val="000000"/>
           <w:sz w:val="18"/>
@@ -4615,6 +5032,7 @@
       </w:r>
       <w:r>
         <w:rPr>
+          <w:rFonts w:ascii="Arial" w:hAnsi="Arial" w:cs="Arial"/>
           <w:color w:val="000000"/>
           <w:sz w:val="18"/>
           <w:highlight w:val="lightGray"/>
@@ -4722,6 +5140,7 @@
         <w:rPr>
           <w:rFonts w:ascii="Roboto Mono" w:hAnsi="Roboto Mono"/>
         </w:rPr>
+        <w:lastRenderedPageBreak/>
         <w:t>Is one of the most well-known web vulnerabilities</w:t>
       </w:r>
     </w:p>
@@ -4757,6 +5176,7 @@
     <w:p>
       <w:r>
         <w:rPr>
+          <w:rFonts w:ascii="Arial" w:hAnsi="Arial" w:cs="Arial"/>
           <w:b/>
           <w:color w:val="000000"/>
           <w:sz w:val="18"/>
@@ -4766,14 +5186,36 @@
       </w:r>
       <w:r>
         <w:rPr>
-          <w:color w:val="000000"/>
-          <w:sz w:val="18"/>
-          <w:highlight w:val="lightGray"/>
-        </w:rPr>
-        <w:t xml:space="preserve">: Persons Table -&gt; ID Column: 1, Name_En Column: Motasem Essam] -&gt; </w:t>
-      </w:r>
-      <w:r>
-        <w:rPr>
+          <w:rFonts w:ascii="Arial" w:hAnsi="Arial" w:cs="Arial"/>
+          <w:color w:val="000000"/>
+          <w:sz w:val="18"/>
+          <w:highlight w:val="lightGray"/>
+        </w:rPr>
+        <w:t xml:space="preserve">: Persons Table -&gt; ID Column: 1, </w:t>
+      </w:r>
+      <w:proofErr w:type="spellStart"/>
+      <w:r>
+        <w:rPr>
+          <w:rFonts w:ascii="Arial" w:hAnsi="Arial" w:cs="Arial"/>
+          <w:color w:val="000000"/>
+          <w:sz w:val="18"/>
+          <w:highlight w:val="lightGray"/>
+        </w:rPr>
+        <w:t>Name_En</w:t>
+      </w:r>
+      <w:proofErr w:type="spellEnd"/>
+      <w:r>
+        <w:rPr>
+          <w:rFonts w:ascii="Arial" w:hAnsi="Arial" w:cs="Arial"/>
+          <w:color w:val="000000"/>
+          <w:sz w:val="18"/>
+          <w:highlight w:val="lightGray"/>
+        </w:rPr>
+        <w:t xml:space="preserve"> Column: Motasem Essam] -&gt; </w:t>
+      </w:r>
+      <w:r>
+        <w:rPr>
+          <w:rFonts w:ascii="Arial" w:hAnsi="Arial" w:cs="Arial"/>
           <w:b/>
           <w:color w:val="000000"/>
           <w:sz w:val="18"/>
@@ -4783,6 +5225,7 @@
       </w:r>
       <w:r>
         <w:rPr>
+          <w:rFonts w:ascii="Arial" w:hAnsi="Arial" w:cs="Arial"/>
           <w:color w:val="000000"/>
           <w:sz w:val="18"/>
           <w:highlight w:val="lightGray"/>
@@ -4791,6 +5234,7 @@
       </w:r>
       <w:r>
         <w:rPr>
+          <w:rFonts w:ascii="Arial" w:hAnsi="Arial" w:cs="Arial"/>
           <w:b/>
           <w:color w:val="000000"/>
           <w:sz w:val="18"/>
@@ -4800,6 +5244,7 @@
       </w:r>
       <w:r>
         <w:rPr>
+          <w:rFonts w:ascii="Arial" w:hAnsi="Arial" w:cs="Arial"/>
           <w:color w:val="000000"/>
           <w:sz w:val="18"/>
           <w:highlight w:val="lightGray"/>
@@ -4951,6 +5396,7 @@
     <w:p>
       <w:r>
         <w:rPr>
+          <w:rFonts w:ascii="Arial" w:hAnsi="Arial" w:cs="Arial"/>
           <w:b/>
           <w:color w:val="000000"/>
           <w:sz w:val="18"/>
@@ -4960,14 +5406,36 @@
       </w:r>
       <w:r>
         <w:rPr>
-          <w:color w:val="000000"/>
-          <w:sz w:val="18"/>
-          <w:highlight w:val="lightGray"/>
-        </w:rPr>
-        <w:t xml:space="preserve">: Persons Table -&gt; ID Column: 1, Name_En Column: Motasem Essam] -&gt; </w:t>
-      </w:r>
-      <w:r>
-        <w:rPr>
+          <w:rFonts w:ascii="Arial" w:hAnsi="Arial" w:cs="Arial"/>
+          <w:color w:val="000000"/>
+          <w:sz w:val="18"/>
+          <w:highlight w:val="lightGray"/>
+        </w:rPr>
+        <w:t xml:space="preserve">: Persons Table -&gt; ID Column: 1, </w:t>
+      </w:r>
+      <w:proofErr w:type="spellStart"/>
+      <w:r>
+        <w:rPr>
+          <w:rFonts w:ascii="Arial" w:hAnsi="Arial" w:cs="Arial"/>
+          <w:color w:val="000000"/>
+          <w:sz w:val="18"/>
+          <w:highlight w:val="lightGray"/>
+        </w:rPr>
+        <w:t>Name_En</w:t>
+      </w:r>
+      <w:proofErr w:type="spellEnd"/>
+      <w:r>
+        <w:rPr>
+          <w:rFonts w:ascii="Arial" w:hAnsi="Arial" w:cs="Arial"/>
+          <w:color w:val="000000"/>
+          <w:sz w:val="18"/>
+          <w:highlight w:val="lightGray"/>
+        </w:rPr>
+        <w:t xml:space="preserve"> Column: Motasem Essam] -&gt; </w:t>
+      </w:r>
+      <w:r>
+        <w:rPr>
+          <w:rFonts w:ascii="Arial" w:hAnsi="Arial" w:cs="Arial"/>
           <w:b/>
           <w:color w:val="000000"/>
           <w:sz w:val="18"/>
@@ -4977,6 +5445,7 @@
       </w:r>
       <w:r>
         <w:rPr>
+          <w:rFonts w:ascii="Arial" w:hAnsi="Arial" w:cs="Arial"/>
           <w:color w:val="000000"/>
           <w:sz w:val="18"/>
           <w:highlight w:val="lightGray"/>
@@ -4985,6 +5454,7 @@
       </w:r>
       <w:r>
         <w:rPr>
+          <w:rFonts w:ascii="Arial" w:hAnsi="Arial" w:cs="Arial"/>
           <w:b/>
           <w:color w:val="000000"/>
           <w:sz w:val="18"/>
@@ -4994,6 +5464,7 @@
       </w:r>
       <w:r>
         <w:rPr>
+          <w:rFonts w:ascii="Arial" w:hAnsi="Arial" w:cs="Arial"/>
           <w:color w:val="000000"/>
           <w:sz w:val="18"/>
           <w:highlight w:val="lightGray"/>
@@ -5269,6 +5740,7 @@
         <w:rPr>
           <w:rFonts w:ascii="Roboto Mono" w:hAnsi="Roboto Mono"/>
         </w:rPr>
+        <w:lastRenderedPageBreak/>
         <w:t>If the receptionist blindly follows the instructions, security is compromised.</w:t>
       </w:r>
     </w:p>
@@ -5371,6 +5843,7 @@
     <w:p>
       <w:r>
         <w:rPr>
+          <w:rFonts w:ascii="Arial" w:hAnsi="Arial" w:cs="Arial"/>
           <w:b/>
           <w:color w:val="000000"/>
           <w:sz w:val="18"/>
@@ -5380,14 +5853,36 @@
       </w:r>
       <w:r>
         <w:rPr>
-          <w:color w:val="000000"/>
-          <w:sz w:val="18"/>
-          <w:highlight w:val="lightGray"/>
-        </w:rPr>
-        <w:t xml:space="preserve">: Persons Table -&gt; ID Column: 1, Name_En Column: Motasem Essam] -&gt; </w:t>
-      </w:r>
-      <w:r>
-        <w:rPr>
+          <w:rFonts w:ascii="Arial" w:hAnsi="Arial" w:cs="Arial"/>
+          <w:color w:val="000000"/>
+          <w:sz w:val="18"/>
+          <w:highlight w:val="lightGray"/>
+        </w:rPr>
+        <w:t xml:space="preserve">: Persons Table -&gt; ID Column: 1, </w:t>
+      </w:r>
+      <w:proofErr w:type="spellStart"/>
+      <w:r>
+        <w:rPr>
+          <w:rFonts w:ascii="Arial" w:hAnsi="Arial" w:cs="Arial"/>
+          <w:color w:val="000000"/>
+          <w:sz w:val="18"/>
+          <w:highlight w:val="lightGray"/>
+        </w:rPr>
+        <w:t>Name_En</w:t>
+      </w:r>
+      <w:proofErr w:type="spellEnd"/>
+      <w:r>
+        <w:rPr>
+          <w:rFonts w:ascii="Arial" w:hAnsi="Arial" w:cs="Arial"/>
+          <w:color w:val="000000"/>
+          <w:sz w:val="18"/>
+          <w:highlight w:val="lightGray"/>
+        </w:rPr>
+        <w:t xml:space="preserve"> Column: Motasem Essam] -&gt; </w:t>
+      </w:r>
+      <w:r>
+        <w:rPr>
+          <w:rFonts w:ascii="Arial" w:hAnsi="Arial" w:cs="Arial"/>
           <w:b/>
           <w:color w:val="000000"/>
           <w:sz w:val="18"/>
@@ -5397,6 +5892,7 @@
       </w:r>
       <w:r>
         <w:rPr>
+          <w:rFonts w:ascii="Arial" w:hAnsi="Arial" w:cs="Arial"/>
           <w:color w:val="000000"/>
           <w:sz w:val="18"/>
           <w:highlight w:val="lightGray"/>
@@ -5405,6 +5901,7 @@
       </w:r>
       <w:r>
         <w:rPr>
+          <w:rFonts w:ascii="Arial" w:hAnsi="Arial" w:cs="Arial"/>
           <w:b/>
           <w:color w:val="000000"/>
           <w:sz w:val="18"/>
@@ -5414,6 +5911,7 @@
       </w:r>
       <w:r>
         <w:rPr>
+          <w:rFonts w:ascii="Arial" w:hAnsi="Arial" w:cs="Arial"/>
           <w:color w:val="000000"/>
           <w:sz w:val="18"/>
           <w:highlight w:val="lightGray"/>

</xml_diff>